<commit_message>
Update CR Model Supplementary
</commit_message>
<xml_diff>
--- a/Supplementary/CR_Model_Supplementary.docx
+++ b/Supplementary/CR_Model_Supplementary.docx
@@ -2589,7 +2589,19 @@
         <w:t>i</w:t>
       </w:r>
       <w:r>
-        <w:t xml:space="preserve">* decreases. This negative frequency-dependent self-limitation — each strain depletes its own private pool as it grows — is the </w:t>
+        <w:t xml:space="preserve">* decreases. This negative frequency-dependent self-limitation </w:t>
+      </w:r>
+      <w:r>
+        <w:t>where</w:t>
+      </w:r>
+      <w:r>
+        <w:t xml:space="preserve"> each strain depletes its own private pool as it grows </w:t>
+      </w:r>
+      <w:r>
+        <w:t>and it</w:t>
+      </w:r>
+      <w:r>
+        <w:t xml:space="preserve"> is the </w:t>
       </w:r>
       <w:proofErr w:type="spellStart"/>
       <w:r>
@@ -2923,22 +2935,6 @@
         <w:lastRenderedPageBreak/>
         <w:t>S4.  Nondimensionalization</w:t>
       </w:r>
-    </w:p>
-    <w:p>
-      <w:pPr>
-        <w:spacing w:before="200" w:after="80"/>
-      </w:pPr>
-      <w:proofErr w:type="spellStart"/>
-      <w:r>
-        <w:rPr>
-          <w:b/>
-          <w:bCs/>
-          <w:sz w:val="23"/>
-          <w:szCs w:val="23"/>
-        </w:rPr>
-        <w:t>Scalings</w:t>
-      </w:r>
-      <w:proofErr w:type="spellEnd"/>
     </w:p>
     <w:p>
       <w:pPr>
@@ -4080,11 +4076,6 @@
     </w:p>
     <w:p>
       <w:pPr>
-        <w:spacing w:after="120" w:line="280" w:lineRule="auto"/>
-      </w:pPr>
-    </w:p>
-    <w:p>
-      <w:pPr>
         <w:spacing w:before="200" w:after="80"/>
       </w:pPr>
       <w:r>
@@ -4619,11 +4610,6 @@
         <w:t xml:space="preserve"> = 0):</w:t>
       </w:r>
     </w:p>
-    <w:p>
-      <w:pPr>
-        <w:spacing w:after="100"/>
-      </w:pPr>
-    </w:p>
     <w:tbl>
       <w:tblPr>
         <w:tblW w:w="9360" w:type="dxa"/>
@@ -4825,11 +4811,6 @@
     </w:p>
     <w:p>
       <w:pPr>
-        <w:spacing w:after="100"/>
-      </w:pPr>
-    </w:p>
-    <w:p>
-      <w:pPr>
         <w:spacing w:before="320" w:after="120"/>
       </w:pPr>
       <w:r>
@@ -5108,16 +5089,6 @@
     </w:tbl>
     <w:p>
       <w:pPr>
-        <w:spacing w:after="100"/>
-      </w:pPr>
-    </w:p>
-    <w:p>
-      <w:pPr>
-        <w:spacing w:after="100"/>
-      </w:pPr>
-    </w:p>
-    <w:p>
-      <w:pPr>
         <w:spacing w:before="320" w:after="120"/>
       </w:pPr>
       <w:r>
@@ -5135,20 +5106,32 @@
         <w:spacing w:after="120" w:line="280" w:lineRule="auto"/>
       </w:pPr>
       <w:r>
-        <w:t>Given strain i at its monoculture steady state Ei, setting xj = ε → 0 in (10) or (11), the term σj/(1+ε) → σj, giving dε/dτ = ε·μj. The mutual invasibility theorem (Hofbauer &amp; Sigmund 1998) states: if μ1 &gt; 0 AND μ2 &gt; 0, then the interior equilibrium E* exists and is globally stable.</w:t>
+        <w:t xml:space="preserve">Given strain i at its monoculture steady state Ei, setting xj = ε → 0 in (10) or (11), the term σj/(1+ε) → σj, giving dε/dτ = ε·μj. </w:t>
       </w:r>
     </w:p>
     <w:p>
       <w:pPr>
         <w:spacing w:before="200" w:after="80"/>
-      </w:pPr>
-      <w:r>
         <w:rPr>
           <w:b/>
           <w:bCs/>
           <w:sz w:val="23"/>
           <w:szCs w:val="23"/>
         </w:rPr>
+      </w:pPr>
+    </w:p>
+    <w:p>
+      <w:pPr>
+        <w:spacing w:before="200" w:after="80"/>
+      </w:pPr>
+      <w:r>
+        <w:rPr>
+          <w:b/>
+          <w:bCs/>
+          <w:sz w:val="23"/>
+          <w:szCs w:val="23"/>
+        </w:rPr>
+        <w:lastRenderedPageBreak/>
         <w:t>Invasion rate of strain 2 invading E₁</w:t>
       </w:r>
     </w:p>
@@ -5177,11 +5160,6 @@
       <w:r>
         <w:t>*, 0, r*), substituting r* from (B’):</w:t>
       </w:r>
-    </w:p>
-    <w:p>
-      <w:pPr>
-        <w:spacing w:after="100"/>
-      </w:pPr>
     </w:p>
     <w:tbl>
       <w:tblPr>
@@ -5284,11 +5262,6 @@
         <w:t>:</w:t>
       </w:r>
     </w:p>
-    <w:p>
-      <w:pPr>
-        <w:spacing w:after="100"/>
-      </w:pPr>
-    </w:p>
     <w:tbl>
       <w:tblPr>
         <w:tblW w:w="9360" w:type="dxa"/>
@@ -5513,11 +5486,6 @@
       <w:r>
         <w:t>:</w:t>
       </w:r>
-    </w:p>
-    <w:p>
-      <w:pPr>
-        <w:spacing w:after="100"/>
-      </w:pPr>
     </w:p>
     <w:tbl>
       <w:tblPr>
@@ -6170,7 +6138,6 @@
           <w:sz w:val="26"/>
           <w:szCs w:val="26"/>
         </w:rPr>
-        <w:lastRenderedPageBreak/>
         <w:t>S8.  The Master Inequality</w:t>
       </w:r>
     </w:p>
@@ -6372,6 +6339,7 @@
         <w:spacing w:after="120" w:line="280" w:lineRule="auto"/>
       </w:pPr>
       <w:r>
+        <w:lastRenderedPageBreak/>
         <w:t xml:space="preserve">These two conditions cannot both be satisfied simultaneously as strict inequalities. Stable coexistence therefore requires that neither strain has a large enough advantage to exclude the other. Define the fitness difference κ and </w:t>
       </w:r>
       <w:r>
@@ -6553,7 +6521,19 @@
         <w:spacing w:after="120" w:line="280" w:lineRule="auto"/>
       </w:pPr>
       <w:r>
-        <w:t xml:space="preserve">The fitness difference κ = k(n₁ − n₂) follows directly from the difference of the approximate invasion rates (I’) and (II’): μ₁ ≈ κ and μ₂ ≈ −κ. The stabilisation S = 2σ₁σ₂/(σ₁ + σ₂) follows from the private pool self-limitation structure derived in S3: strain i suppresses only its own private pool Rᵢ, so the intraspecific self-limitation of each strain equals σᵢ, while the interspecific effect on the competitor through the private pool is zero. The harmonic mean of σ₁ and σ₂ therefore gives the net stabilisation — the excess of self-limitation over cross-limitation. Coexistence is stable when stabilisation exceeds fitness difference, |κ| &lt; S </w:t>
+        <w:t xml:space="preserve">The fitness difference κ = k(n₁ − n₂) follows directly from the difference of the approximate invasion rates (I’) and (II’): μ₁ ≈ κ and μ₂ ≈ −κ. The stabilisation S = 2σ₁σ₂/(σ₁ + σ₂) follows from the private pool self-limitation structure derived in S3: strain i suppresses only its own private pool Rᵢ, so the intraspecific self-limitation of each strain equals σᵢ, while the interspecific effect on the competitor through the private pool is zero. The harmonic mean of σ₁ and σ₂ therefore gives the net </w:t>
+      </w:r>
+      <w:r>
+        <w:t>stabilization</w:t>
+      </w:r>
+      <w:r>
+        <w:t xml:space="preserve"> </w:t>
+      </w:r>
+      <w:r>
+        <w:t xml:space="preserve">where </w:t>
+      </w:r>
+      <w:r>
+        <w:t xml:space="preserve">the excess of self-limitation over cross-limitation. Coexistence is stable when stabilisation exceeds fitness difference, |κ| &lt; S </w:t>
       </w:r>
       <w:hyperlink r:id="rId6" w:history="1">
         <w:r>
@@ -6737,7 +6717,13 @@
         <w:t xml:space="preserve">):  </w:t>
       </w:r>
       <w:r>
-        <w:t xml:space="preserve">harmonic mean of private niche sizes — the </w:t>
+        <w:t>harmonic mean of private niche sizes</w:t>
+      </w:r>
+      <w:r>
+        <w:t>,</w:t>
+      </w:r>
+      <w:r>
+        <w:t xml:space="preserve"> the </w:t>
       </w:r>
       <w:r>
         <w:t>stabilization</w:t>
@@ -7292,7 +7278,6 @@
           <w:sz w:val="26"/>
           <w:szCs w:val="26"/>
         </w:rPr>
-        <w:lastRenderedPageBreak/>
         <w:t>S9.  The Hard Wall</w:t>
       </w:r>
     </w:p>
@@ -7433,11 +7418,9 @@
       <w:r>
         <w:t xml:space="preserve"> − 2ρ − 1 = 0 are ρ = 1 ± √2. The quadratic is negative only for ρ &lt; 1 + √2. </w:t>
       </w:r>
-      <w:proofErr w:type="gramStart"/>
-      <w:r>
-        <w:t>Therefore</w:t>
-      </w:r>
-      <w:proofErr w:type="gramEnd"/>
+      <w:r>
+        <w:t>Therefore,</w:t>
+      </w:r>
       <w:r>
         <w:t xml:space="preserve"> coexistence under the master inequality is impossible when:</w:t>
       </w:r>
@@ -7571,13 +7554,22 @@
         <w:spacing w:after="120" w:line="280" w:lineRule="auto"/>
       </w:pPr>
       <w:r>
-        <w:t>When both exact invasion rates are positive (μ₁ &gt; 0 and μ₂ &gt; 0), an interior fixed point E* = (x₁*, x₂*, r*) exists in the positive orthant. It is found numerically by solving (10)–(12) simultaneously with all time derivatives set to zero.</w:t>
-      </w:r>
-    </w:p>
-    <w:p>
-      <w:pPr>
-        <w:spacing w:after="100"/>
-      </w:pPr>
+        <w:t xml:space="preserve">When both exact invasion rates are positive (μ₁ &gt; 0 and μ₂ &gt; 0), an interior </w:t>
+      </w:r>
+      <w:proofErr w:type="gramStart"/>
+      <w:r>
+        <w:t>fixed point</w:t>
+      </w:r>
+      <w:proofErr w:type="gramEnd"/>
+      <w:r>
+        <w:t xml:space="preserve"> E* = (x₁*, x₂*, r*)</w:t>
+      </w:r>
+      <w:r>
+        <w:t xml:space="preserve">. </w:t>
+      </w:r>
+      <w:r>
+        <w:t>It is found numerically by solving (10)–(12) simultaneously with all time derivatives set to zero.</w:t>
+      </w:r>
     </w:p>
     <w:p>
       <w:pPr>
@@ -8064,152 +8056,6 @@
       <w:r>
         <w:t xml:space="preserve"> all competition is mediated through shared resource r.</w:t>
       </w:r>
-    </w:p>
-    <w:p>
-      <w:pPr>
-        <w:spacing w:after="100"/>
-      </w:pPr>
-    </w:p>
-    <w:p>
-      <w:pPr>
-        <w:spacing w:before="200" w:after="80"/>
-      </w:pPr>
-      <w:r>
-        <w:rPr>
-          <w:b/>
-          <w:bCs/>
-          <w:sz w:val="23"/>
-          <w:szCs w:val="23"/>
-        </w:rPr>
-        <w:t>Stability verification</w:t>
-      </w:r>
-    </w:p>
-    <w:p>
-      <w:pPr>
-        <w:spacing w:after="120" w:line="280" w:lineRule="auto"/>
-      </w:pPr>
-      <w:r>
-        <w:rPr>
-          <w:b/>
-          <w:bCs/>
-        </w:rPr>
-        <w:t xml:space="preserve">1.  </w:t>
-      </w:r>
-      <w:r>
-        <w:t>E</w:t>
-      </w:r>
-      <w:r>
-        <w:rPr>
-          <w:vertAlign w:val="subscript"/>
-        </w:rPr>
-        <w:t>1</w:t>
-      </w:r>
-      <w:r>
-        <w:t xml:space="preserve"> and E</w:t>
-      </w:r>
-      <w:r>
-        <w:rPr>
-          <w:vertAlign w:val="subscript"/>
-        </w:rPr>
-        <w:t>2</w:t>
-      </w:r>
-      <w:r>
-        <w:t xml:space="preserve"> are unstable: exact invasion rates μ</w:t>
-      </w:r>
-      <w:r>
-        <w:rPr>
-          <w:vertAlign w:val="subscript"/>
-        </w:rPr>
-        <w:t>1</w:t>
-      </w:r>
-      <w:r>
-        <w:t xml:space="preserve"> &gt; 0 and μ</w:t>
-      </w:r>
-      <w:r>
-        <w:rPr>
-          <w:vertAlign w:val="subscript"/>
-        </w:rPr>
-        <w:t>2</w:t>
-      </w:r>
-      <w:r>
-        <w:t xml:space="preserve"> &gt; 0 for both pairs (confirmed numerically). Unstable manifolds of E</w:t>
-      </w:r>
-      <w:r>
-        <w:rPr>
-          <w:vertAlign w:val="subscript"/>
-        </w:rPr>
-        <w:t>1</w:t>
-      </w:r>
-      <w:r>
-        <w:t xml:space="preserve"> and E</w:t>
-      </w:r>
-      <w:r>
-        <w:rPr>
-          <w:vertAlign w:val="subscript"/>
-        </w:rPr>
-        <w:t>2</w:t>
-      </w:r>
-      <w:r>
-        <w:t xml:space="preserve"> point into the interior of the positive orthant.</w:t>
-      </w:r>
-    </w:p>
-    <w:p>
-      <w:pPr>
-        <w:spacing w:after="120" w:line="280" w:lineRule="auto"/>
-      </w:pPr>
-      <w:r>
-        <w:rPr>
-          <w:b/>
-          <w:bCs/>
-        </w:rPr>
-        <w:t xml:space="preserve"> 2.  </w:t>
-      </w:r>
-      <w:r>
-        <w:t>The positive orthant is forward-invariant: resource depletion through equations (3)–(5) prevents unbounded population growth.</w:t>
-      </w:r>
-    </w:p>
-    <w:p>
-      <w:pPr>
-        <w:spacing w:after="120" w:line="280" w:lineRule="auto"/>
-      </w:pPr>
-      <w:r>
-        <w:rPr>
-          <w:b/>
-          <w:bCs/>
-        </w:rPr>
-        <w:t xml:space="preserve">3.  </w:t>
-      </w:r>
-      <w:r>
-        <w:t xml:space="preserve">By the mutual </w:t>
-      </w:r>
-      <w:proofErr w:type="spellStart"/>
-      <w:r>
-        <w:t>invasibility</w:t>
-      </w:r>
-      <w:proofErr w:type="spellEnd"/>
-      <w:r>
-        <w:t xml:space="preserve"> criterion (Hofbauer &amp; Sigmund 1998), these two properties together guarantee convergence to an interior attractor E*.</w:t>
-      </w:r>
-    </w:p>
-    <w:p>
-      <w:pPr>
-        <w:spacing w:after="120" w:line="280" w:lineRule="auto"/>
-      </w:pPr>
-      <w:r>
-        <w:rPr>
-          <w:b/>
-          <w:bCs/>
-        </w:rPr>
-        <w:t xml:space="preserve">4.  </w:t>
-      </w:r>
-      <w:r>
-        <w:t>All three eigenvalues of J at E* are computed numerically and confirmed to have negative real parts:</w:t>
-      </w:r>
-    </w:p>
-    <w:p>
-      <w:pPr>
-        <w:spacing w:after="100"/>
-      </w:pPr>
     </w:p>
     <w:tbl>
       <w:tblPr>
@@ -8911,11 +8757,6 @@
     </w:p>
     <w:p>
       <w:pPr>
-        <w:spacing w:after="120" w:line="280" w:lineRule="auto"/>
-      </w:pPr>
-    </w:p>
-    <w:p>
-      <w:pPr>
         <w:spacing w:before="320" w:after="120"/>
       </w:pPr>
       <w:r>
@@ -8941,23 +8782,6 @@
       </w:r>
       <w:r>
         <w:t xml:space="preserve"> 31, 343–366.</w:t>
-      </w:r>
-    </w:p>
-    <w:p>
-      <w:pPr>
-        <w:spacing w:after="80"/>
-      </w:pPr>
-      <w:r>
-        <w:t xml:space="preserve">Hofbauer, J. and Sigmund, K. (1998). </w:t>
-      </w:r>
-      <w:r>
-        <w:rPr>
-          <w:i/>
-        </w:rPr>
-        <w:t>Evolutionary Games and Population Dynamics.</w:t>
-      </w:r>
-      <w:r>
-        <w:t xml:space="preserve"> Cambridge University Press.</w:t>
       </w:r>
     </w:p>
     <w:p>

</xml_diff>